<commit_message>
S08: DOC-fonte mais ricos (tabelas de indicadores + casos criticos)
A pedido do user, os documentos-fonte deixam de ser sinteses magras:
- Pedidos: tabela por servico (pedidos, fora do prazo, %, satisfacao media)
  + tabela de casos criticos. Numeros computados do dataset real (openpyxl).
- Carga docente: tabela por departamento (docentes, ocupacao media,
  sobrecarga critica, faltas) + distribuicao da sobrecarga.
Mais realista, da mais para auditar, e da ao Copilot dados para gerar
um grafico no deck (o teste interessante). Gabarito do exercicio alinhado
com a tabela por departamento. (Sem imagem de grafico embebida: matplotlib
ausente e a imagem nao passa no caminho do colar; o Copilot gera o grafico
a partir da tabela.)

Co-Authored-By: Claude Opus 4.8 (1M context) <noreply@anthropic.com>
</commit_message>
<xml_diff>
--- a/sessoes/sessao-08/DOC_S08_Sintese_Carga_Docente.docx
+++ b/sessoes/sessao-08/DOC_S08_Sintese_Carga_Docente.docx
@@ -25,9 +25,367 @@
     </w:p>
     <w:p>
       <w:r>
-        <w:t>Análise da carga docente do 1.º semestre (10 docentes), por departamento, taxa de ocupação e faltas, para apoiar o planeamento de recursos antes do próximo semestre.</w:t>
+        <w:t>Análise da carga docente do 1.º semestre (10 docentes), por departamento, taxa de ocupação e faltas, para apoiar o planeamento de recursos antes do próximo semestre. A taxa de ocupação cruza as horas letivas e não letivas com as horas contratadas; acima de 115% considera-se sobrecarga crítica, entre 105% e 115% elevada.</w:t>
       </w:r>
     </w:p>
+    <w:p>
+      <w:pPr>
+        <w:pStyle w:val="Heading1"/>
+      </w:pPr>
+      <w:r>
+        <w:t>Indicadores por departamento</w:t>
+      </w:r>
+    </w:p>
+    <w:tbl>
+      <w:tblPr>
+        <w:tblStyle w:val="TableGrid"/>
+        <w:tblW w:type="auto" w:w="0"/>
+        <w:tblLook w:firstColumn="1" w:firstRow="1" w:lastColumn="0" w:lastRow="0" w:noHBand="0" w:noVBand="1" w:val="04A0"/>
+      </w:tblPr>
+      <w:tblGrid>
+        <w:gridCol w:w="1728"/>
+        <w:gridCol w:w="1728"/>
+        <w:gridCol w:w="1728"/>
+        <w:gridCol w:w="1728"/>
+        <w:gridCol w:w="1728"/>
+      </w:tblGrid>
+      <w:tr>
+        <w:tc>
+          <w:tcPr>
+            <w:tcW w:type="dxa" w:w="1728"/>
+          </w:tcPr>
+          <w:p>
+            <w:r>
+              <w:rPr>
+                <w:b/>
+              </w:rPr>
+              <w:t>Departamento</w:t>
+            </w:r>
+          </w:p>
+        </w:tc>
+        <w:tc>
+          <w:tcPr>
+            <w:tcW w:type="dxa" w:w="1728"/>
+          </w:tcPr>
+          <w:p>
+            <w:r>
+              <w:rPr>
+                <w:b/>
+              </w:rPr>
+              <w:t>Docentes</w:t>
+            </w:r>
+          </w:p>
+        </w:tc>
+        <w:tc>
+          <w:tcPr>
+            <w:tcW w:type="dxa" w:w="1728"/>
+          </w:tcPr>
+          <w:p>
+            <w:r>
+              <w:rPr>
+                <w:b/>
+              </w:rPr>
+              <w:t>Ocupação média</w:t>
+            </w:r>
+          </w:p>
+        </w:tc>
+        <w:tc>
+          <w:tcPr>
+            <w:tcW w:type="dxa" w:w="1728"/>
+          </w:tcPr>
+          <w:p>
+            <w:r>
+              <w:rPr>
+                <w:b/>
+              </w:rPr>
+              <w:t>Sobrecarga crítica</w:t>
+            </w:r>
+          </w:p>
+        </w:tc>
+        <w:tc>
+          <w:tcPr>
+            <w:tcW w:type="dxa" w:w="1728"/>
+          </w:tcPr>
+          <w:p>
+            <w:r>
+              <w:rPr>
+                <w:b/>
+              </w:rPr>
+              <w:t>Faltas médias</w:t>
+            </w:r>
+          </w:p>
+        </w:tc>
+      </w:tr>
+      <w:tr>
+        <w:tc>
+          <w:tcPr>
+            <w:tcW w:type="dxa" w:w="1728"/>
+          </w:tcPr>
+          <w:p>
+            <w:r>
+              <w:t>Informática</w:t>
+            </w:r>
+          </w:p>
+        </w:tc>
+        <w:tc>
+          <w:tcPr>
+            <w:tcW w:type="dxa" w:w="1728"/>
+          </w:tcPr>
+          <w:p>
+            <w:r>
+              <w:t>3</w:t>
+            </w:r>
+          </w:p>
+        </w:tc>
+        <w:tc>
+          <w:tcPr>
+            <w:tcW w:type="dxa" w:w="1728"/>
+          </w:tcPr>
+          <w:p>
+            <w:r>
+              <w:t>119%</w:t>
+            </w:r>
+          </w:p>
+        </w:tc>
+        <w:tc>
+          <w:tcPr>
+            <w:tcW w:type="dxa" w:w="1728"/>
+          </w:tcPr>
+          <w:p>
+            <w:r>
+              <w:t>1</w:t>
+            </w:r>
+          </w:p>
+        </w:tc>
+        <w:tc>
+          <w:tcPr>
+            <w:tcW w:type="dxa" w:w="1728"/>
+          </w:tcPr>
+          <w:p>
+            <w:r>
+              <w:t>1.7</w:t>
+            </w:r>
+          </w:p>
+        </w:tc>
+      </w:tr>
+      <w:tr>
+        <w:tc>
+          <w:tcPr>
+            <w:tcW w:type="dxa" w:w="1728"/>
+          </w:tcPr>
+          <w:p>
+            <w:r>
+              <w:t>Matemática</w:t>
+            </w:r>
+          </w:p>
+        </w:tc>
+        <w:tc>
+          <w:tcPr>
+            <w:tcW w:type="dxa" w:w="1728"/>
+          </w:tcPr>
+          <w:p>
+            <w:r>
+              <w:t>4</w:t>
+            </w:r>
+          </w:p>
+        </w:tc>
+        <w:tc>
+          <w:tcPr>
+            <w:tcW w:type="dxa" w:w="1728"/>
+          </w:tcPr>
+          <w:p>
+            <w:r>
+              <w:t>111%</w:t>
+            </w:r>
+          </w:p>
+        </w:tc>
+        <w:tc>
+          <w:tcPr>
+            <w:tcW w:type="dxa" w:w="1728"/>
+          </w:tcPr>
+          <w:p>
+            <w:r>
+              <w:t>0</w:t>
+            </w:r>
+          </w:p>
+        </w:tc>
+        <w:tc>
+          <w:tcPr>
+            <w:tcW w:type="dxa" w:w="1728"/>
+          </w:tcPr>
+          <w:p>
+            <w:r>
+              <w:t>2.0</w:t>
+            </w:r>
+          </w:p>
+        </w:tc>
+      </w:tr>
+      <w:tr>
+        <w:tc>
+          <w:tcPr>
+            <w:tcW w:type="dxa" w:w="1728"/>
+          </w:tcPr>
+          <w:p>
+            <w:r>
+              <w:t>Gestão</w:t>
+            </w:r>
+          </w:p>
+        </w:tc>
+        <w:tc>
+          <w:tcPr>
+            <w:tcW w:type="dxa" w:w="1728"/>
+          </w:tcPr>
+          <w:p>
+            <w:r>
+              <w:t>3</w:t>
+            </w:r>
+          </w:p>
+        </w:tc>
+        <w:tc>
+          <w:tcPr>
+            <w:tcW w:type="dxa" w:w="1728"/>
+          </w:tcPr>
+          <w:p>
+            <w:r>
+              <w:t>107%</w:t>
+            </w:r>
+          </w:p>
+        </w:tc>
+        <w:tc>
+          <w:tcPr>
+            <w:tcW w:type="dxa" w:w="1728"/>
+          </w:tcPr>
+          <w:p>
+            <w:r>
+              <w:t>0</w:t>
+            </w:r>
+          </w:p>
+        </w:tc>
+        <w:tc>
+          <w:tcPr>
+            <w:tcW w:type="dxa" w:w="1728"/>
+          </w:tcPr>
+          <w:p>
+            <w:r>
+              <w:t>3.7</w:t>
+            </w:r>
+          </w:p>
+        </w:tc>
+      </w:tr>
+    </w:tbl>
+    <w:p>
+      <w:pPr>
+        <w:pStyle w:val="Heading1"/>
+      </w:pPr>
+      <w:r>
+        <w:t>Distribuição da sobrecarga</w:t>
+      </w:r>
+    </w:p>
+    <w:tbl>
+      <w:tblPr>
+        <w:tblStyle w:val="TableGrid"/>
+        <w:tblW w:type="auto" w:w="0"/>
+        <w:tblLook w:firstColumn="1" w:firstRow="1" w:lastColumn="0" w:lastRow="0" w:noHBand="0" w:noVBand="1" w:val="04A0"/>
+      </w:tblPr>
+      <w:tblGrid>
+        <w:gridCol w:w="4320"/>
+        <w:gridCol w:w="4320"/>
+      </w:tblGrid>
+      <w:tr>
+        <w:tc>
+          <w:tcPr>
+            <w:tcW w:type="dxa" w:w="4320"/>
+          </w:tcPr>
+          <w:p>
+            <w:r>
+              <w:rPr>
+                <w:b/>
+              </w:rPr>
+              <w:t>Nível</w:t>
+            </w:r>
+          </w:p>
+        </w:tc>
+        <w:tc>
+          <w:tcPr>
+            <w:tcW w:type="dxa" w:w="4320"/>
+          </w:tcPr>
+          <w:p>
+            <w:r>
+              <w:rPr>
+                <w:b/>
+              </w:rPr>
+              <w:t>Docentes</w:t>
+            </w:r>
+          </w:p>
+        </w:tc>
+      </w:tr>
+      <w:tr>
+        <w:tc>
+          <w:tcPr>
+            <w:tcW w:type="dxa" w:w="4320"/>
+          </w:tcPr>
+          <w:p>
+            <w:r>
+              <w:t>Crítica (&gt;115%)</w:t>
+            </w:r>
+          </w:p>
+        </w:tc>
+        <w:tc>
+          <w:tcPr>
+            <w:tcW w:type="dxa" w:w="4320"/>
+          </w:tcPr>
+          <w:p>
+            <w:r>
+              <w:t>1</w:t>
+            </w:r>
+          </w:p>
+        </w:tc>
+      </w:tr>
+      <w:tr>
+        <w:tc>
+          <w:tcPr>
+            <w:tcW w:type="dxa" w:w="4320"/>
+          </w:tcPr>
+          <w:p>
+            <w:r>
+              <w:t>Elevada (105-115%)</w:t>
+            </w:r>
+          </w:p>
+        </w:tc>
+        <w:tc>
+          <w:tcPr>
+            <w:tcW w:type="dxa" w:w="4320"/>
+          </w:tcPr>
+          <w:p>
+            <w:r>
+              <w:t>7</w:t>
+            </w:r>
+          </w:p>
+        </w:tc>
+      </w:tr>
+      <w:tr>
+        <w:tc>
+          <w:tcPr>
+            <w:tcW w:type="dxa" w:w="4320"/>
+          </w:tcPr>
+          <w:p>
+            <w:r>
+              <w:t>Normal (≤105%)</w:t>
+            </w:r>
+          </w:p>
+        </w:tc>
+        <w:tc>
+          <w:tcPr>
+            <w:tcW w:type="dxa" w:w="4320"/>
+          </w:tcPr>
+          <w:p>
+            <w:r>
+              <w:t>2</w:t>
+            </w:r>
+          </w:p>
+        </w:tc>
+      </w:tr>
+    </w:tbl>
     <w:p>
       <w:pPr>
         <w:pStyle w:val="Heading1"/>
@@ -41,7 +399,7 @@
         <w:pStyle w:val="ListBullet"/>
       </w:pPr>
       <w:r>
-        <w:t>A taxa de ocupação média mais alta é a do departamento de Informática (cerca de 119%).</w:t>
+        <w:t>O departamento de Informática é o mais pressionado (ocupação média ~119%).</w:t>
       </w:r>
     </w:p>
     <w:p>
@@ -49,7 +407,7 @@
         <w:pStyle w:val="ListBullet"/>
       </w:pPr>
       <w:r>
-        <w:t>Há 1 caso de sobrecarga crítica (taxa de ocupação acima de 115%) e 7 docentes em sobrecarga elevada (entre 105% e 115%).</w:t>
+        <w:t>Há 1 caso de sobrecarga crítica e 7 docentes em sobrecarga elevada.</w:t>
       </w:r>
     </w:p>
     <w:p>
@@ -57,7 +415,7 @@
         <w:pStyle w:val="ListBullet"/>
       </w:pPr>
       <w:r>
-        <w:t>Os restantes departamentos apresentam ocupação média mais moderada.</w:t>
+        <w:t>Os restantes departamentos têm ocupação média mais moderada.</w:t>
       </w:r>
     </w:p>
     <w:p>

</xml_diff>